<commit_message>
Update all CVs: Maersk end date July 2026, add immediate start availability
</commit_message>
<xml_diff>
--- a/applications/word/05_SociableSociety_CV.docx
+++ b/applications/word/05_SociableSociety_CV.docx
@@ -495,7 +495,7 @@
           <w:color w:val="555555"/>
           <w:sz w:val="20"/>
         </w:rPr>
-        <w:t>Columbus, OH | December 2024 – Present</w:t>
+        <w:t>Columbus, OH | December 2024 – July 2026</w:t>
       </w:r>
     </w:p>
     <w:p>
@@ -852,7 +852,7 @@
           <w:color w:val="555555"/>
           <w:sz w:val="20"/>
         </w:rPr>
-        <w:t>Authorized to work in the United States — EAD C08 (no sponsorship required) | Available for fully remote work</w:t>
+        <w:t>Authorized to work in the United States — EAD C08 (no sponsorship required) | Available for fully remote work — immediate start</w:t>
       </w:r>
     </w:p>
     <w:sectPr>

</xml_diff>